<commit_message>
Require official admission-check links for unknown admission records.
Unknown status stays unverified but always carries an informationUrl, admission_lookup citation, and clickable visitor/exhibition fallbacks in dashboard, Markdown, and DOCX exports.

Co-authored-by: Cursor <cursoragent@cursor.com>
</commit_message>
<xml_diff>
--- a/data/yuranja_exhibitions_approved.docx
+++ b/data/yuranja_exhibitions_approved.docx
@@ -133,8 +133,19 @@
         <w:t xml:space="preserve">Admission: </w:t>
       </w:r>
       <w:r>
-        <w:t>Check current admission (unknown)</w:t>
+        <w:t>Admission not published</w:t>
       </w:r>
+    </w:p>
+    <w:p>
+      <w:hyperlink r:id="rId9">
+        <w:r>
+          <w:rPr>
+            <w:color w:val="0563C1"/>
+            <w:u w:val="single"/>
+          </w:rPr>
+          <w:t>Official exhibition page</w:t>
+        </w:r>
+      </w:hyperlink>
     </w:p>
     <w:p>
       <w:r>
@@ -169,20 +180,32 @@
         </w:rPr>
         <w:t xml:space="preserve">Official exhibition URL: </w:t>
       </w:r>
-      <w:r>
-        <w:t>https://berlinischegalerie.de/en/exhibitions/</w:t>
-      </w:r>
+      <w:hyperlink r:id="rId9">
+        <w:r>
+          <w:rPr>
+            <w:color w:val="0563C1"/>
+            <w:u w:val="single"/>
+          </w:rPr>
+          <w:t>Official exhibition page</w:t>
+        </w:r>
+      </w:hyperlink>
     </w:p>
     <w:p>
       <w:r>
         <w:rPr>
           <w:b/>
         </w:rPr>
-        <w:t xml:space="preserve">Official admission URL: </w:t>
+        <w:t xml:space="preserve">Admission check: </w:t>
       </w:r>
-      <w:r>
-        <w:t>none verified</w:t>
-      </w:r>
+      <w:hyperlink r:id="rId9">
+        <w:r>
+          <w:rPr>
+            <w:color w:val="0563C1"/>
+            <w:u w:val="single"/>
+          </w:rPr>
+          <w:t>Official exhibition page</w:t>
+        </w:r>
+      </w:hyperlink>
     </w:p>
     <w:p>
       <w:r>
@@ -280,8 +303,19 @@
         <w:t xml:space="preserve">Admission: </w:t>
       </w:r>
       <w:r>
-        <w:t>Check current admission (unknown)</w:t>
+        <w:t>Admission not published</w:t>
       </w:r>
+    </w:p>
+    <w:p>
+      <w:hyperlink r:id="rId10">
+        <w:r>
+          <w:rPr>
+            <w:color w:val="0563C1"/>
+            <w:u w:val="single"/>
+          </w:rPr>
+          <w:t>Official exhibition page</w:t>
+        </w:r>
+      </w:hyperlink>
     </w:p>
     <w:p>
       <w:r>
@@ -316,20 +350,32 @@
         </w:rPr>
         <w:t xml:space="preserve">Official exhibition URL: </w:t>
       </w:r>
-      <w:r>
-        <w:t>https://www.fundacionjumex.org/en/exposiciones/789-richard-prince-cuentamelo-todo</w:t>
-      </w:r>
+      <w:hyperlink r:id="rId10">
+        <w:r>
+          <w:rPr>
+            <w:color w:val="0563C1"/>
+            <w:u w:val="single"/>
+          </w:rPr>
+          <w:t>Official exhibition page</w:t>
+        </w:r>
+      </w:hyperlink>
     </w:p>
     <w:p>
       <w:r>
         <w:rPr>
           <w:b/>
         </w:rPr>
-        <w:t xml:space="preserve">Official admission URL: </w:t>
+        <w:t xml:space="preserve">Admission check: </w:t>
       </w:r>
-      <w:r>
-        <w:t>none verified</w:t>
-      </w:r>
+      <w:hyperlink r:id="rId10">
+        <w:r>
+          <w:rPr>
+            <w:color w:val="0563C1"/>
+            <w:u w:val="single"/>
+          </w:rPr>
+          <w:t>Official exhibition page</w:t>
+        </w:r>
+      </w:hyperlink>
     </w:p>
     <w:p>
       <w:r>
@@ -419,8 +465,19 @@
         <w:t xml:space="preserve">Admission: </w:t>
       </w:r>
       <w:r>
-        <w:t>Check current admission (unknown)</w:t>
+        <w:t>Admission not published</w:t>
       </w:r>
+    </w:p>
+    <w:p>
+      <w:hyperlink r:id="rId11">
+        <w:r>
+          <w:rPr>
+            <w:color w:val="0563C1"/>
+            <w:u w:val="single"/>
+          </w:rPr>
+          <w:t>Official exhibition page</w:t>
+        </w:r>
+      </w:hyperlink>
     </w:p>
     <w:p>
       <w:r>
@@ -455,20 +512,32 @@
         </w:rPr>
         <w:t xml:space="preserve">Official exhibition URL: </w:t>
       </w:r>
-      <w:r>
-        <w:t>https://www.fundacionjumex.org/en/exposiciones/756-raul-silva-gateway</w:t>
-      </w:r>
+      <w:hyperlink r:id="rId11">
+        <w:r>
+          <w:rPr>
+            <w:color w:val="0563C1"/>
+            <w:u w:val="single"/>
+          </w:rPr>
+          <w:t>Official exhibition page</w:t>
+        </w:r>
+      </w:hyperlink>
     </w:p>
     <w:p>
       <w:r>
         <w:rPr>
           <w:b/>
         </w:rPr>
-        <w:t xml:space="preserve">Official admission URL: </w:t>
+        <w:t xml:space="preserve">Admission check: </w:t>
       </w:r>
-      <w:r>
-        <w:t>none verified</w:t>
-      </w:r>
+      <w:hyperlink r:id="rId11">
+        <w:r>
+          <w:rPr>
+            <w:color w:val="0563C1"/>
+            <w:u w:val="single"/>
+          </w:rPr>
+          <w:t>Official exhibition page</w:t>
+        </w:r>
+      </w:hyperlink>
     </w:p>
     <w:p>
       <w:r>
@@ -566,8 +635,19 @@
         <w:t xml:space="preserve">Admission: </w:t>
       </w:r>
       <w:r>
-        <w:t>Check current admission (unknown)</w:t>
+        <w:t>Admission not published</w:t>
       </w:r>
+    </w:p>
+    <w:p>
+      <w:hyperlink r:id="rId12">
+        <w:r>
+          <w:rPr>
+            <w:color w:val="0563C1"/>
+            <w:u w:val="single"/>
+          </w:rPr>
+          <w:t>Official exhibition page</w:t>
+        </w:r>
+      </w:hyperlink>
     </w:p>
     <w:p>
       <w:r>
@@ -602,20 +682,32 @@
         </w:rPr>
         <w:t xml:space="preserve">Official exhibition URL: </w:t>
       </w:r>
-      <w:r>
-        <w:t>https://www.centrepompidou.fr/en/program/calendar/event/7y50FlA</w:t>
-      </w:r>
+      <w:hyperlink r:id="rId12">
+        <w:r>
+          <w:rPr>
+            <w:color w:val="0563C1"/>
+            <w:u w:val="single"/>
+          </w:rPr>
+          <w:t>Official exhibition page</w:t>
+        </w:r>
+      </w:hyperlink>
     </w:p>
     <w:p>
       <w:r>
         <w:rPr>
           <w:b/>
         </w:rPr>
-        <w:t xml:space="preserve">Official admission URL: </w:t>
+        <w:t xml:space="preserve">Admission check: </w:t>
       </w:r>
-      <w:r>
-        <w:t>none verified</w:t>
-      </w:r>
+      <w:hyperlink r:id="rId12">
+        <w:r>
+          <w:rPr>
+            <w:color w:val="0563C1"/>
+            <w:u w:val="single"/>
+          </w:rPr>
+          <w:t>Official exhibition page</w:t>
+        </w:r>
+      </w:hyperlink>
     </w:p>
     <w:p>
       <w:r>
@@ -705,8 +797,19 @@
         <w:t xml:space="preserve">Admission: </w:t>
       </w:r>
       <w:r>
-        <w:t>Check current admission (unknown)</w:t>
+        <w:t>Admission not published</w:t>
       </w:r>
+    </w:p>
+    <w:p>
+      <w:hyperlink r:id="rId13">
+        <w:r>
+          <w:rPr>
+            <w:color w:val="0563C1"/>
+            <w:u w:val="single"/>
+          </w:rPr>
+          <w:t>Official exhibition page</w:t>
+        </w:r>
+      </w:hyperlink>
     </w:p>
     <w:p>
       <w:r>
@@ -741,20 +844,32 @@
         </w:rPr>
         <w:t xml:space="preserve">Official exhibition URL: </w:t>
       </w:r>
-      <w:r>
-        <w:t>https://www.centrepompidou.fr/fr/programme/agenda/evenement/f4odRda</w:t>
-      </w:r>
+      <w:hyperlink r:id="rId13">
+        <w:r>
+          <w:rPr>
+            <w:color w:val="0563C1"/>
+            <w:u w:val="single"/>
+          </w:rPr>
+          <w:t>Official exhibition page</w:t>
+        </w:r>
+      </w:hyperlink>
     </w:p>
     <w:p>
       <w:r>
         <w:rPr>
           <w:b/>
         </w:rPr>
-        <w:t xml:space="preserve">Official admission URL: </w:t>
+        <w:t xml:space="preserve">Admission check: </w:t>
       </w:r>
-      <w:r>
-        <w:t>none verified</w:t>
-      </w:r>
+      <w:hyperlink r:id="rId13">
+        <w:r>
+          <w:rPr>
+            <w:color w:val="0563C1"/>
+            <w:u w:val="single"/>
+          </w:rPr>
+          <w:t>Official exhibition page</w:t>
+        </w:r>
+      </w:hyperlink>
     </w:p>
     <w:p>
       <w:r>

</xml_diff>